<commit_message>
Link the handoff to the shared private repository
</commit_message>
<xml_diff>
--- a/docs/LABMATE_HANDOFF.docx
+++ b/docs/LABMATE_HANDOFF.docx
@@ -16,7 +16,7 @@
           <w:color w:val="464646"/>
           <w:sz w:val="20"/>
         </w:rPr>
-        <w:t>Version 2.1 | 24 October 2026 | Four builders and four coding agents | Six hour build budget</w:t>
+        <w:t>Version 2.2 | 24 October 2026 | Four builders and four coding agents | Six hour build budget</w:t>
       </w:r>
     </w:p>
     <w:p>
@@ -59,7 +59,18 @@
         <w:t>Who should start where.</w:t>
       </w:r>
       <w:r>
-        <w:t xml:space="preserve"> All four builders and agents read sections 1 through 6 and 19 through 21. A owns the student interface, B the review engine and contracts, C evidence and Snowflake, and D voice and integration. Each teammate runs one agent in an isolated checkout. New sessions start with section 17. The included coordination kit makes progress and messages visible through Git; it is not connected to a team repository yet.</w:t>
+        <w:t xml:space="preserve"> All four builders and agents read sections 1 through 6 and 19 through 21. A owns the student interface, B the review engine and contracts, C evidence and Snowflake, and D voice and integration. Each teammate runs one agent in an isolated checkout. New sessions start with section 17. The private </w:t>
+      </w:r>
+      <w:hyperlink r:id="rId9">
+        <w:r>
+          <w:rPr>
+            <w:color w:val="185C85"/>
+          </w:rPr>
+          <w:t>shared starter repository</w:t>
+        </w:r>
+      </w:hyperlink>
+      <w:r>
+        <w:t xml:space="preserve"> contains the handoff and coordination kit. Teammates need collaborator access; the application scaffold is still pending.</w:t>
       </w:r>
     </w:p>
     <w:p>
@@ -11975,7 +11986,7 @@
       <w:r>
         <w:t xml:space="preserve"> Use the shared </w:t>
       </w:r>
-      <w:hyperlink r:id="rId9">
+      <w:hyperlink r:id="rId10">
         <w:r>
           <w:rPr>
             <w:color w:val="185C85"/>
@@ -14054,7 +14065,7 @@
       <w:r>
         <w:t xml:space="preserve"> Event schedule, submission flow, and sponsor challenges, read October 24, 2026. </w:t>
       </w:r>
-      <w:hyperlink r:id="rId10">
+      <w:hyperlink r:id="rId11">
         <w:r>
           <w:rPr>
             <w:color w:val="185C85"/>
@@ -14079,7 +14090,7 @@
       <w:r>
         <w:t xml:space="preserve"> Schema output support and Responses examples. </w:t>
       </w:r>
-      <w:hyperlink r:id="rId11">
+      <w:hyperlink r:id="rId12">
         <w:r>
           <w:rPr>
             <w:color w:val="185C85"/>
@@ -14104,7 +14115,7 @@
       <w:r>
         <w:t xml:space="preserve"> Image message formats and model support considerations. </w:t>
       </w:r>
-      <w:hyperlink r:id="rId12">
+      <w:hyperlink r:id="rId13">
         <w:r>
           <w:rPr>
             <w:color w:val="185C85"/>
@@ -14129,7 +14140,7 @@
       <w:r>
         <w:t xml:space="preserve"> REST endpoint, columns, filters, and limits. </w:t>
       </w:r>
-      <w:hyperlink r:id="rId13">
+      <w:hyperlink r:id="rId14">
         <w:r>
           <w:rPr>
             <w:color w:val="185C85"/>
@@ -14154,7 +14165,7 @@
       <w:r>
         <w:t xml:space="preserve"> Service creation and source query requirements. </w:t>
       </w:r>
-      <w:hyperlink r:id="rId14">
+      <w:hyperlink r:id="rId15">
         <w:r>
           <w:rPr>
             <w:color w:val="185C85"/>
@@ -14179,7 +14190,7 @@
       <w:r>
         <w:t xml:space="preserve"> Multipart transcription endpoint. </w:t>
       </w:r>
-      <w:hyperlink r:id="rId15">
+      <w:hyperlink r:id="rId16">
         <w:r>
           <w:rPr>
             <w:color w:val="185C85"/>
@@ -14204,7 +14215,7 @@
       <w:r>
         <w:t xml:space="preserve"> Text to speech endpoint and output. </w:t>
       </w:r>
-      <w:hyperlink r:id="rId16">
+      <w:hyperlink r:id="rId17">
         <w:r>
           <w:rPr>
             <w:color w:val="185C85"/>
@@ -14229,7 +14240,7 @@
       <w:r>
         <w:t xml:space="preserve"> Directory, frontmatter, naming, and validation. </w:t>
       </w:r>
-      <w:hyperlink r:id="rId17">
+      <w:hyperlink r:id="rId18">
         <w:r>
           <w:rPr>
             <w:color w:val="185C85"/>
@@ -14254,7 +14265,7 @@
       <w:r>
         <w:t xml:space="preserve"> Laboratory risk management framework for educational source curation. </w:t>
       </w:r>
-      <w:hyperlink r:id="rId18">
+      <w:hyperlink r:id="rId19">
         <w:r>
           <w:rPr>
             <w:color w:val="185C85"/>
@@ -14279,7 +14290,7 @@
       <w:r>
         <w:t xml:space="preserve"> Server configuration and public variable behavior. </w:t>
       </w:r>
-      <w:hyperlink r:id="rId19">
+      <w:hyperlink r:id="rId20">
         <w:r>
           <w:rPr>
             <w:color w:val="185C85"/>
@@ -14304,7 +14315,7 @@
       <w:r>
         <w:t xml:space="preserve"> Secure contexts, permissions, and media capture. </w:t>
       </w:r>
-      <w:hyperlink r:id="rId20">
+      <w:hyperlink r:id="rId21">
         <w:r>
           <w:rPr>
             <w:color w:val="185C85"/>
@@ -14329,7 +14340,7 @@
       <w:r>
         <w:t xml:space="preserve"> Isolation for parallel coding tasks; coordination still requires an agreed workflow. </w:t>
       </w:r>
-      <w:hyperlink r:id="rId21">
+      <w:hyperlink r:id="rId22">
         <w:r>
           <w:rPr>
             <w:color w:val="185C85"/>
@@ -14372,7 +14383,7 @@
       </w:r>
     </w:p>
     <w:sectPr>
-      <w:footerReference w:type="default" r:id="rId22"/>
+      <w:footerReference w:type="default" r:id="rId23"/>
       <w:pgSz w:w="12240" w:h="15840"/>
       <w:pgMar w:top="936" w:right="1037" w:bottom="936" w:left="1037" w:header="720" w:footer="360" w:gutter="0"/>
       <w:cols w:space="720"/>

</xml_diff>